<commit_message>
Wrong date on resume
</commit_message>
<xml_diff>
--- a/MarkJenningsResume.docx
+++ b/MarkJenningsResume.docx
@@ -1468,25 +1468,7 @@
                 <w:sz w:val="24"/>
                 <w:szCs w:val="24"/>
               </w:rPr>
-              <w:t>habilitation and Neuromuscular (</w:t>
-            </w:r>
-            <w:proofErr w:type="spellStart"/>
-            <w:r>
-              <w:rPr>
-                <w:rFonts w:cstheme="minorHAnsi"/>
-                <w:sz w:val="24"/>
-                <w:szCs w:val="24"/>
-              </w:rPr>
-              <w:t>ReNeu</w:t>
-            </w:r>
-            <w:proofErr w:type="spellEnd"/>
-            <w:r>
-              <w:rPr>
-                <w:rFonts w:cstheme="minorHAnsi"/>
-                <w:sz w:val="24"/>
-                <w:szCs w:val="24"/>
-              </w:rPr>
-              <w:t>)</w:t>
+              <w:t>habilitation and Neuromuscular (ReNeu)</w:t>
             </w:r>
             <w:r>
               <w:rPr>
@@ -2025,18 +2007,8 @@
                 <w:sz w:val="20"/>
                 <w:szCs w:val="20"/>
               </w:rPr>
-              <w:t xml:space="preserve"> </w:t>
-            </w:r>
-            <w:proofErr w:type="spellStart"/>
-            <w:r>
-              <w:rPr>
-                <w:rFonts w:cstheme="minorHAnsi"/>
-                <w:sz w:val="20"/>
-                <w:szCs w:val="20"/>
-              </w:rPr>
-              <w:t>Onshape</w:t>
-            </w:r>
-            <w:proofErr w:type="spellEnd"/>
+              <w:t xml:space="preserve"> Onshape</w:t>
+            </w:r>
             <w:r>
               <w:rPr>
                 <w:rFonts w:cstheme="minorHAnsi"/>
@@ -2341,25 +2313,7 @@
                 <w:sz w:val="20"/>
                 <w:szCs w:val="20"/>
               </w:rPr>
-              <w:t xml:space="preserve">Analysis: FEA, tolerance </w:t>
-            </w:r>
-            <w:proofErr w:type="spellStart"/>
-            <w:r>
-              <w:rPr>
-                <w:rFonts w:cstheme="minorHAnsi"/>
-                <w:sz w:val="20"/>
-                <w:szCs w:val="20"/>
-              </w:rPr>
-              <w:t>stackup</w:t>
-            </w:r>
-            <w:proofErr w:type="spellEnd"/>
-            <w:r>
-              <w:rPr>
-                <w:rFonts w:cstheme="minorHAnsi"/>
-                <w:sz w:val="20"/>
-                <w:szCs w:val="20"/>
-              </w:rPr>
-              <w:t>, actuator selection, bushing/bearing selection, FMEA</w:t>
+              <w:t>Analysis: FEA, tolerance stackup, actuator selection, bushing/bearing selection, FMEA</w:t>
             </w:r>
           </w:p>
           <w:p>
@@ -2667,16 +2621,7 @@
                 <w:sz w:val="20"/>
                 <w:szCs w:val="20"/>
               </w:rPr>
-              <w:t xml:space="preserve"> </w:t>
-            </w:r>
-            <w:r>
-              <w:rPr>
-                <w:rFonts w:cstheme="minorHAnsi"/>
-                <w:i/>
-                <w:sz w:val="20"/>
-                <w:szCs w:val="20"/>
-              </w:rPr>
-              <w:t>Present</w:t>
+              <w:t xml:space="preserve"> 2024</w:t>
             </w:r>
           </w:p>
           <w:p>
@@ -5086,15 +5031,6 @@
   </w:num>
   <w:num w:numId="20" w16cid:durableId="26758797">
     <w:abstractNumId w:val="13"/>
-    <w:lvlOverride w:ilvl="0"/>
-    <w:lvlOverride w:ilvl="1"/>
-    <w:lvlOverride w:ilvl="2"/>
-    <w:lvlOverride w:ilvl="3"/>
-    <w:lvlOverride w:ilvl="4"/>
-    <w:lvlOverride w:ilvl="5"/>
-    <w:lvlOverride w:ilvl="6"/>
-    <w:lvlOverride w:ilvl="7"/>
-    <w:lvlOverride w:ilvl="8"/>
   </w:num>
 </w:numbering>
 </file>
@@ -5502,6 +5438,7 @@
   <w:style w:type="character" w:default="1" w:styleId="DefaultParagraphFont">
     <w:name w:val="Default Paragraph Font"/>
     <w:uiPriority w:val="1"/>
+    <w:semiHidden/>
     <w:unhideWhenUsed/>
   </w:style>
   <w:style w:type="table" w:default="1" w:styleId="TableNormal">

</xml_diff>